<commit_message>
refactor: replace system python3 (3.9) with uv run python3 (3.13)
System Python 3.9.6 is EOL. All python3 invocations now go through
`uv run python3`, which uses uv-managed Python 3.13 via .python-version.

- Add .python-version pinning to 3.13
- Update shebangs to #!/usr/bin/env -S uv run python3 (156 .py files)
- Update hooks/hooks.json (12 hook commands)
- Update SKILL.md hook commands and inline invocations (~50 .md files)
- Update shell scripts (~10 .sh files)
- Update subprocess calls in hook .py files
- Update auto-loader-usage.py constraint regex

Intentionally left: WRDS SGE wrapper (/usr/local/bin/python3),
pixi exec contexts, guard pattern-matching strings, Jupyter kernel metadata.

Co-Authored-By: Claude Opus 4.6 <noreply@anthropic.com>
</commit_message>
<xml_diff>
--- a/skills/writing-legal/templates/law_review_template.docx
+++ b/skills/writing-legal/templates/law_review_template.docx
@@ -214,14 +214,12 @@
       <w:framePr w:wrap="around" w:vAnchor="text" w:hAnchor="margin" w:xAlign="center" w:y="1"/>
       <w:rPr>
         <w:rStyle w:val="PageNumber"/>
-        <w:rFonts w:ascii="Times New Roman" w:hAnsi="Times New Roman"/>
         <w:szCs w:val="24"/>
       </w:rPr>
     </w:pPr>
     <w:r>
       <w:rPr>
         <w:rStyle w:val="PageNumber"/>
-        <w:rFonts w:ascii="Times New Roman" w:hAnsi="Times New Roman"/>
         <w:szCs w:val="24"/>
       </w:rPr>
       <w:fldChar w:fldCharType="begin"/>
@@ -229,7 +227,6 @@
     <w:r>
       <w:rPr>
         <w:rStyle w:val="PageNumber"/>
-        <w:rFonts w:ascii="Times New Roman" w:hAnsi="Times New Roman"/>
         <w:szCs w:val="24"/>
       </w:rPr>
       <w:instrText xml:space="preserve">PAGE  </w:instrText>
@@ -237,7 +234,6 @@
     <w:r>
       <w:rPr>
         <w:rStyle w:val="PageNumber"/>
-        <w:rFonts w:ascii="Times New Roman" w:hAnsi="Times New Roman"/>
         <w:szCs w:val="24"/>
       </w:rPr>
       <w:fldChar w:fldCharType="separate"/>
@@ -245,7 +241,6 @@
     <w:r>
       <w:rPr>
         <w:rStyle w:val="PageNumber"/>
-        <w:rFonts w:ascii="Times New Roman" w:hAnsi="Times New Roman"/>
         <w:noProof/>
         <w:szCs w:val="24"/>
       </w:rPr>
@@ -254,7 +249,6 @@
     <w:r>
       <w:rPr>
         <w:rStyle w:val="PageNumber"/>
-        <w:rFonts w:ascii="Times New Roman" w:hAnsi="Times New Roman"/>
         <w:szCs w:val="24"/>
       </w:rPr>
       <w:fldChar w:fldCharType="end"/>
@@ -263,9 +257,7 @@
   <w:p>
     <w:pPr>
       <w:pStyle w:val="Footer"/>
-      <w:rPr>
-        <w:rFonts w:ascii="Times New Roman" w:hAnsi="Times New Roman"/>
-      </w:rPr>
+      <w:rPr/>
     </w:pPr>
   </w:p>
 </w:ftr>
@@ -279,14 +271,12 @@
       <w:framePr w:wrap="around" w:vAnchor="text" w:hAnchor="margin" w:xAlign="center" w:y="1"/>
       <w:rPr>
         <w:rStyle w:val="PageNumber"/>
-        <w:rFonts w:ascii="Times New Roman" w:hAnsi="Times New Roman"/>
         <w:szCs w:val="24"/>
       </w:rPr>
     </w:pPr>
     <w:r>
       <w:rPr>
         <w:rStyle w:val="PageNumber"/>
-        <w:rFonts w:ascii="Times New Roman" w:hAnsi="Times New Roman"/>
         <w:szCs w:val="24"/>
       </w:rPr>
       <w:fldChar w:fldCharType="begin"/>
@@ -294,7 +284,6 @@
     <w:r>
       <w:rPr>
         <w:rStyle w:val="PageNumber"/>
-        <w:rFonts w:ascii="Times New Roman" w:hAnsi="Times New Roman"/>
         <w:szCs w:val="24"/>
       </w:rPr>
       <w:instrText xml:space="preserve">PAGE  </w:instrText>
@@ -302,7 +291,6 @@
     <w:r>
       <w:rPr>
         <w:rStyle w:val="PageNumber"/>
-        <w:rFonts w:ascii="Times New Roman" w:hAnsi="Times New Roman"/>
         <w:szCs w:val="24"/>
       </w:rPr>
       <w:fldChar w:fldCharType="separate"/>
@@ -310,7 +298,6 @@
     <w:r>
       <w:rPr>
         <w:rStyle w:val="PageNumber"/>
-        <w:rFonts w:ascii="Times New Roman" w:hAnsi="Times New Roman"/>
         <w:noProof/>
         <w:szCs w:val="24"/>
       </w:rPr>
@@ -319,7 +306,6 @@
     <w:r>
       <w:rPr>
         <w:rStyle w:val="PageNumber"/>
-        <w:rFonts w:ascii="Times New Roman" w:hAnsi="Times New Roman"/>
         <w:szCs w:val="24"/>
       </w:rPr>
       <w:fldChar w:fldCharType="end"/>
@@ -329,7 +315,6 @@
     <w:pPr>
       <w:pStyle w:val="Footer"/>
       <w:rPr>
-        <w:rFonts w:ascii="Times New Roman" w:hAnsi="Times New Roman"/>
         <w:szCs w:val="24"/>
       </w:rPr>
     </w:pPr>
@@ -366,7 +351,6 @@
       <w:pStyle w:val="Header"/>
       <w:jc w:val="right"/>
       <w:rPr>
-        <w:rFonts w:ascii="Times New Roman" w:hAnsi="Times New Roman"/>
         <w:smallCaps/>
         <w:sz w:val="18"/>
         <w:szCs w:val="18"/>
@@ -374,7 +358,6 @@
     </w:pPr>
     <w:r>
       <w:rPr>
-        <w:rFonts w:ascii="Times New Roman" w:hAnsi="Times New Roman"/>
         <w:smallCaps/>
         <w:sz w:val="18"/>
         <w:szCs w:val="18"/>
@@ -3964,6 +3947,17 @@
     <w:link w:val="FootnoteTextChar"/>
     <w:unhideWhenUsed/>
     <w:rsid w:val="00371654"/>
+    <w:pPr>
+      <w:tabs>
+        <w:tab w:val="right" w:pos="677"/>
+        <w:tab w:val="right" w:pos="907"/>
+      </w:tabs>
+      <w:ind w:firstLine="677"/>
+    </w:pPr>
+    <w:rPr>
+      <w:sz w:val="20"/>
+      <w:szCs w:val="20"/>
+    </w:rPr>
   </w:style>
   <w:style w:type="character" w:customStyle="1" w:styleId="FootnoteTextChar">
     <w:name w:val="Footnote Text Char"/>
@@ -4589,6 +4583,31 @@
     <w:rPr>
       <w:b/>
       <w:smallCaps/>
+    </w:rPr>
+  </w:style>
+  <w:style w:type="paragraph" w:styleId="Author">
+    <w:name w:val="Author"/>
+    <w:basedOn w:val="Normal"/>
+    <w:next w:val="BodyText"/>
+    <w:uiPriority w:val="11"/>
+    <w:qFormat/>
+    <w:pPr>
+      <w:spacing w:before="0" w:after="120"/>
+      <w:jc w:val="center"/>
+    </w:pPr>
+  </w:style>
+  <w:style w:type="paragraph" w:styleId="Date">
+    <w:name w:val="Date"/>
+    <w:basedOn w:val="Normal"/>
+    <w:next w:val="BodyText"/>
+    <w:uiPriority w:val="12"/>
+    <w:qFormat/>
+    <w:pPr>
+      <w:spacing w:before="0" w:after="480"/>
+      <w:jc w:val="center"/>
+    </w:pPr>
+    <w:rPr>
+      <w:i/>
     </w:rPr>
   </w:style>
 </w:styles>

</xml_diff>

<commit_message>
fix(docx): fix pandoc-citeproc mid-footnote paren-wrap; rename fix_footnotes.py
Pandoc-citeproc wraps mid-paragraph bracketed citations inside footnotes
with a leading double-space and parens. fix_footnotes.py (renamed from
fix_gdocs_footnotes.py) now detects and strips these wraps while preserving
author-written explanatory parentheticals. build_docx.py runs it automatically
via --fix-footnotes (the default). Documents the root cause and XML signature
in law-review-docx/SKILL.md.

Co-Authored-By: Claude Sonnet 4.6 <noreply@anthropic.com>
</commit_message>
<xml_diff>
--- a/skills/writing-legal/templates/law_review_template.docx
+++ b/skills/writing-legal/templates/law_review_template.docx
@@ -3226,7 +3226,11 @@
         <w:lang w:val="en-US" w:eastAsia="en-US" w:bidi="ar-SA"/>
       </w:rPr>
     </w:rPrDefault>
-    <w:pPrDefault/>
+    <w:pPrDefault>
+      <w:pPr>
+        <w:widowControl/>
+      </w:pPr>
+    </w:pPrDefault>
   </w:docDefaults>
   <w:latentStyles w:defLockedState="0" w:defUIPriority="99" w:defSemiHidden="0" w:defUnhideWhenUsed="0" w:defQFormat="0" w:count="376">
     <w:lsdException w:name="Normal" w:uiPriority="0" w:qFormat="1"/>
@@ -4608,6 +4612,31 @@
     </w:pPr>
     <w:rPr>
       <w:i/>
+    </w:rPr>
+  </w:style>
+  <w:style w:type="paragraph" w:customStyle="1" w:styleId="Abstract">
+    <w:name w:val="Abstract"/>
+    <w:basedOn w:val="BodyText"/>
+    <w:pPr>
+      <w:spacing w:before="120" w:after="120"/>
+      <w:ind w:left="720" w:right="720" w:firstLine="0"/>
+    </w:pPr>
+    <w:rPr>
+      <w:i/>
+      <w:sz w:val="22"/>
+    </w:rPr>
+  </w:style>
+  <w:style w:type="paragraph" w:customStyle="1" w:styleId="AbstractHeading">
+    <w:name w:val="Abstract Heading"/>
+    <w:basedOn w:val="Normal"/>
+    <w:pPr>
+      <w:spacing w:before="240" w:after="120"/>
+      <w:jc w:val="center"/>
+    </w:pPr>
+    <w:rPr>
+      <w:b/>
+      <w:smallCaps/>
+      <w:sz w:val="22"/>
     </w:rPr>
   </w:style>
 </w:styles>

</xml_diff>

<commit_message>
Bump to v5.9.0: footnote-style restoration + law-review running-head redesign
docx-footnotes:
- fix_footnotes.py: restore missing FNStyleBest/FNStyleBestChar style
  definitions from the law-review reference template when a Google Docs
  round-trip strips them (ensure_footnote_styles, --template flag,
  fnstylebest_style_undefined detection); reads/writes styles.xml
- declutter FNStyleBest in the reference template (drop inert val-less
  <w:u> and white <w:shd> baked in from a prior GDocs round-trip)

law-review-docx:
- template: positional-tab running header — journal cite centered +
  short title at the right margin; cite-only header on the title page
  (first/even/default header refs over the existing titlePg)
- build_docx.py: new journal_cite metadata field; replace_short_title ->
  replace_header_placeholders fills {{JOURNAL_CITE}} and {{SHORT_TITLE}}

Co-Authored-By: Claude Opus 4.7 (1M context) <noreply@anthropic.com>
</commit_message>
<xml_diff>
--- a/skills/writing-legal/templates/law_review_template.docx
+++ b/skills/writing-legal/templates/law_review_template.docx
@@ -172,6 +172,8 @@
     </w:p>
     <w:sectPr>
       <w:headerReference w:type="default" r:id="rId11"/>
+      <w:headerReference w:type="first" r:id="rId16"/>
+      <w:headerReference w:type="even" r:id="rId11"/>
       <w:footerReference w:type="even" r:id="rId12"/>
       <w:footerReference w:type="default" r:id="rId13"/>
       <w:pgSz w:w="12240" w:h="15840"/>
@@ -349,7 +351,7 @@
   <w:p>
     <w:pPr>
       <w:pStyle w:val="Header"/>
-      <w:jc w:val="right"/>
+      <w:jc w:val="left"/>
       <w:rPr>
         <w:smallCaps/>
         <w:sz w:val="18"/>
@@ -362,7 +364,55 @@
         <w:sz w:val="18"/>
         <w:szCs w:val="18"/>
       </w:rPr>
-      <w:t>{{SHORT_TITLE}}</w:t>
+      <w:ptab w:relativeTo="margin" w:alignment="center" w:leader="none"/>
+    </w:r>
+    <w:r>
+      <w:rPr>
+        <w:smallCaps/>
+        <w:sz w:val="18"/>
+        <w:szCs w:val="18"/>
+      </w:rPr>
+      <w:t xml:space="preserve">{{JOURNAL_CITE}}</w:t>
+    </w:r>
+    <w:r>
+      <w:rPr>
+        <w:smallCaps/>
+        <w:sz w:val="18"/>
+        <w:szCs w:val="18"/>
+      </w:rPr>
+      <w:ptab w:relativeTo="margin" w:alignment="right" w:leader="none"/>
+    </w:r>
+    <w:r>
+      <w:rPr>
+        <w:smallCaps/>
+        <w:sz w:val="18"/>
+        <w:szCs w:val="18"/>
+      </w:rPr>
+      <w:t xml:space="preserve">{{SHORT_TITLE}}</w:t>
+    </w:r>
+  </w:p>
+</w:hdr>
+</file>
+
+<file path=word/header_cite.xml><?xml version="1.0" encoding="utf-8"?>
+<w:hdr xmlns:wpc="http://schemas.microsoft.com/office/word/2010/wordprocessingCanvas" xmlns:cx="http://schemas.microsoft.com/office/drawing/2014/chartex" xmlns:cx1="http://schemas.microsoft.com/office/drawing/2015/9/8/chartex" xmlns:cx2="http://schemas.microsoft.com/office/drawing/2015/10/21/chartex" xmlns:cx3="http://schemas.microsoft.com/office/drawing/2016/5/9/chartex" xmlns:cx4="http://schemas.microsoft.com/office/drawing/2016/5/10/chartex" xmlns:cx5="http://schemas.microsoft.com/office/drawing/2016/5/11/chartex" xmlns:cx6="http://schemas.microsoft.com/office/drawing/2016/5/12/chartex" xmlns:cx7="http://schemas.microsoft.com/office/drawing/2016/5/13/chartex" xmlns:cx8="http://schemas.microsoft.com/office/drawing/2016/5/14/chartex" xmlns:mc="http://schemas.openxmlformats.org/markup-compatibility/2006" xmlns:aink="http://schemas.microsoft.com/office/drawing/2016/ink" xmlns:am3d="http://schemas.microsoft.com/office/drawing/2017/model3d" xmlns:o="urn:schemas-microsoft-com:office:office" xmlns:oel="http://schemas.microsoft.com/office/2019/extlst" xmlns:r="http://schemas.openxmlformats.org/officeDocument/2006/relationships" xmlns:m="http://schemas.openxmlformats.org/officeDocument/2006/math" xmlns:v="urn:schemas-microsoft-com:vml" xmlns:wp14="http://schemas.microsoft.com/office/word/2010/wordprocessingDrawing" xmlns:wp="http://schemas.openxmlformats.org/drawingml/2006/wordprocessingDrawing" xmlns:w10="urn:schemas-microsoft-com:office:word" xmlns:w="http://schemas.openxmlformats.org/wordprocessingml/2006/main" xmlns:w14="http://schemas.microsoft.com/office/word/2010/wordml" xmlns:w15="http://schemas.microsoft.com/office/word/2012/wordml" xmlns:w16cex="http://schemas.microsoft.com/office/word/2018/wordml/cex" xmlns:w16cid="http://schemas.microsoft.com/office/word/2016/wordml/cid" xmlns:w16="http://schemas.microsoft.com/office/word/2018/wordml" xmlns:w16du="http://schemas.microsoft.com/office/word/2023/wordml/word16du" xmlns:w16sdtdh="http://schemas.microsoft.com/office/word/2020/wordml/sdtdatahash" xmlns:w16sdtfl="http://schemas.microsoft.com/office/word/2024/wordml/sdtformatlock" xmlns:w16se="http://schemas.microsoft.com/office/word/2015/wordml/symex" xmlns:wpg="http://schemas.microsoft.com/office/word/2010/wordprocessingGroup" xmlns:wpi="http://schemas.microsoft.com/office/word/2010/wordprocessingInk" xmlns:wne="http://schemas.microsoft.com/office/word/2006/wordml" xmlns:wps="http://schemas.microsoft.com/office/word/2010/wordprocessingShape" mc:Ignorable="w14 w15 w16se w16cid w16 w16cex w16sdtdh w16sdtfl w16du wp14">
+  <w:p>
+    <w:pPr>
+      <w:pStyle w:val="Header"/>
+      <w:jc w:val="center"/>
+      <w:rPr>
+        <w:smallCaps/>
+        <w:sz w:val="18"/>
+        <w:szCs w:val="18"/>
+      </w:rPr>
+    </w:pPr>
+    <w:r>
+      <w:rPr>
+        <w:smallCaps/>
+        <w:sz w:val="18"/>
+        <w:szCs w:val="18"/>
+      </w:rPr>
+      <w:t xml:space="preserve">{{JOURNAL_CITE}}</w:t>
     </w:r>
   </w:p>
 </w:hdr>
@@ -4362,8 +4412,6 @@
     </w:pPr>
     <w:rPr>
       <w:sz w:val="20"/>
-      <w:u w:color="0077CC"/>
-      <w:shd w:val="clear" w:color="auto" w:fill="FFFFFF"/>
     </w:rPr>
   </w:style>
   <w:style w:type="character" w:customStyle="1" w:styleId="FNStyleBestChar">
@@ -4373,7 +4421,6 @@
     <w:rsid w:val="001732E1"/>
     <w:rPr>
       <w:sz w:val="20"/>
-      <w:u w:color="0077CC"/>
       <w:lang w:eastAsia="ko-KR" w:bidi="en-US"/>
     </w:rPr>
   </w:style>

</xml_diff>